<commit_message>
Record follow-up audit, timing, and progress validation
</commit_message>
<xml_diff>
--- a/October 26, 2026 Dress Rehearsal Audit and fixes.docx
+++ b/October 26, 2026 Dress Rehearsal Audit and fixes.docx
@@ -595,12 +595,12 @@
         <w:t>Verification status.</w:t>
       </w:r>
       <w:r>
-        <w:t xml:space="preserve"> The fixes are saved locally and deployed to Supabase and GitHub Pages. Security release 24b8f3c is live. The cloud gateway also includes the follow-up two-operation memory guard. Eleven bounded live access checks passed.</w:t>
+        <w:t xml:space="preserve"> The security fixes are saved locally and deployed to Supabase and GitHub Pages. Final code release 71ce482 includes the account privacy fix, partial-coaching status and progress timeline. The gateway update is deployed; the local production build and desktop and mobile visual checks passed.</w:t>
       </w:r>
     </w:p>
     <w:p>
       <w:r>
-        <w:t>The absence of a finding in these checks does not establish that every vulnerability is absent. The remaining risks and launch actions are recorded on the final page.</w:t>
+        <w:t>The absence of a finding in these checks does not establish that every vulnerability is absent. The remaining risks and launch actions are recorded in this report.</w:t>
       </w:r>
     </w:p>
     <w:p>
@@ -2250,7 +2250,7 @@
                 <w:b w:val="0"/>
                 <w:sz w:val="19"/>
               </w:rPr>
-              <w:t>452 of 452 Node tests and 19 of 19 Python worker tests passed; production build passed</w:t>
+              <w:t>474 of 474 Node tests and 19 of 19 Python worker tests passed; production build passed</w:t>
             </w:r>
           </w:p>
         </w:tc>
@@ -2526,7 +2526,7 @@
                 <w:b w:val="0"/>
                 <w:sz w:val="19"/>
               </w:rPr>
-              <w:t>GitHub Pages release 24b8f3c deployed successfully. The live page returned HTTP 200 with enforcing Content Security Policy and no-referrer settings. The production sign-in UI initialized without console errors. The latest gateway memory guard is deployed.</w:t>
+              <w:t>GitHub Pages release 71ce482 completed deployment successfully. The gateway includes bounded progress streaming and partial-result handling. The timeline passed desktop and mobile visual checks with simulated events; paid end-to-end progress was not rerun.</w:t>
             </w:r>
           </w:p>
         </w:tc>
@@ -2621,6 +2621,520 @@
       </w:r>
       <w:r>
         <w:t xml:space="preserve"> Test fixtures were isolated, database assertions used rollback, and the report excludes student content, credentials and private infrastructure identifiers. Final release evidence should be tied to the deployed commit recorded above.</w:t>
+      </w:r>
+    </w:p>
+    <w:p>
+      <w:r>
+        <w:br w:type="page"/>
+      </w:r>
+    </w:p>
+    <w:p>
+      <w:pPr>
+        <w:spacing w:after="80"/>
+      </w:pPr>
+      <w:r>
+        <w:rPr>
+          <w:b/>
+          <w:color w:val="4B2E6A"/>
+          <w:sz w:val="18"/>
+        </w:rPr>
+        <w:t>07  AUDIT FINDINGS</w:t>
+      </w:r>
+    </w:p>
+    <w:p>
+      <w:pPr>
+        <w:pStyle w:val="Heading1"/>
+      </w:pPr>
+      <w:r>
+        <w:t>Follow up security and rehearsal verification</w:t>
+      </w:r>
+    </w:p>
+    <w:p>
+      <w:r>
+        <w:t>Account switching could leave the previous student’s recording titles visible when loading failed. History now clears immediately on identity changes, even if session lookup fails. Server ownership checks already protected the underlying recordings.</w:t>
+      </w:r>
+    </w:p>
+    <w:p>
+      <w:r>
+        <w:rPr>
+          <w:b/>
+        </w:rPr>
+        <w:t>Verification.</w:t>
+      </w:r>
+      <w:r>
+        <w:t xml:space="preserve"> All 10 account tests, 12 deployed access checks, 70 malformed-input checks, 7 adversarial stream checks, 4 live stream-boundary probes and 474 full application tests passed. The access probes used no student session or paid processing.</w:t>
+      </w:r>
+    </w:p>
+    <w:p>
+      <w:r>
+        <w:t>Brave exposed a partial-coaching defect: a missing audience score left the overall rating blank. Partial results are now explicitly identified and can be retried; the fix does not guarantee that future model responses will include every score.</w:t>
+      </w:r>
+    </w:p>
+    <w:tbl>
+      <w:tblPr>
+        <w:tblW w:type="auto" w:w="0"/>
+        <w:jc w:val="center"/>
+        <w:tblLayout w:type="fixed"/>
+        <w:tblLook w:firstColumn="1" w:firstRow="1" w:lastColumn="0" w:lastRow="0" w:noHBand="0" w:noVBand="1" w:val="04A0"/>
+      </w:tblPr>
+      <w:tblGrid>
+        <w:gridCol w:w="2376"/>
+        <w:gridCol w:w="7704"/>
+      </w:tblGrid>
+      <w:tr>
+        <w:trPr>
+          <w:cantSplit/>
+          <w:tblHeader/>
+        </w:trPr>
+        <w:tc>
+          <w:tcPr>
+            <w:tcW w:type="dxa" w:w="2376"/>
+            <w:vAlign w:val="center"/>
+            <w:tcMar>
+              <w:top w:w="105" w:type="dxa"/>
+              <w:left w:w="105" w:type="dxa"/>
+              <w:bottom w:w="105" w:type="dxa"/>
+              <w:right w:w="105" w:type="dxa"/>
+            </w:tcMar>
+            <w:tcBorders>
+              <w:top w:val="single" w:sz="4" w:color="D9D9D9"/>
+              <w:left w:val="single" w:sz="4" w:color="D9D9D9"/>
+              <w:bottom w:val="single" w:sz="4" w:color="D9D9D9"/>
+              <w:right w:val="single" w:sz="4" w:color="D9D9D9"/>
+            </w:tcBorders>
+            <w:shd w:fill="3D3548"/>
+          </w:tcPr>
+          <w:p>
+            <w:pPr>
+              <w:spacing w:after="0" w:line="259" w:lineRule="auto"/>
+            </w:pPr>
+            <w:r>
+              <w:rPr>
+                <w:rFonts w:ascii="Georgia" w:hAnsi="Georgia"/>
+                <w:b/>
+                <w:color w:val="FFFFFF"/>
+                <w:sz w:val="19"/>
+              </w:rPr>
+              <w:t>Run</w:t>
+            </w:r>
+          </w:p>
+        </w:tc>
+        <w:tc>
+          <w:tcPr>
+            <w:tcW w:type="dxa" w:w="7704"/>
+            <w:vAlign w:val="center"/>
+            <w:tcMar>
+              <w:top w:w="105" w:type="dxa"/>
+              <w:left w:w="105" w:type="dxa"/>
+              <w:bottom w:w="105" w:type="dxa"/>
+              <w:right w:w="105" w:type="dxa"/>
+            </w:tcMar>
+            <w:tcBorders>
+              <w:top w:val="single" w:sz="4" w:color="D9D9D9"/>
+              <w:left w:val="single" w:sz="4" w:color="D9D9D9"/>
+              <w:bottom w:val="single" w:sz="4" w:color="D9D9D9"/>
+              <w:right w:val="single" w:sz="4" w:color="D9D9D9"/>
+            </w:tcBorders>
+            <w:shd w:fill="3D3548"/>
+          </w:tcPr>
+          <w:p>
+            <w:pPr>
+              <w:spacing w:after="0" w:line="259" w:lineRule="auto"/>
+            </w:pPr>
+            <w:r>
+              <w:rPr>
+                <w:rFonts w:ascii="Georgia" w:hAnsi="Georgia"/>
+                <w:b/>
+                <w:color w:val="FFFFFF"/>
+                <w:sz w:val="19"/>
+              </w:rPr>
+              <w:t>Observed outcome</w:t>
+            </w:r>
+          </w:p>
+        </w:tc>
+      </w:tr>
+      <w:tr>
+        <w:trPr>
+          <w:cantSplit/>
+        </w:trPr>
+        <w:tc>
+          <w:tcPr>
+            <w:tcW w:type="dxa" w:w="2376"/>
+            <w:vAlign w:val="center"/>
+            <w:tcMar>
+              <w:top w:w="105" w:type="dxa"/>
+              <w:left w:w="105" w:type="dxa"/>
+              <w:bottom w:w="105" w:type="dxa"/>
+              <w:right w:w="105" w:type="dxa"/>
+            </w:tcMar>
+            <w:tcBorders>
+              <w:top w:val="single" w:sz="4" w:color="D9D9D9"/>
+              <w:left w:val="single" w:sz="4" w:color="D9D9D9"/>
+              <w:bottom w:val="single" w:sz="4" w:color="D9D9D9"/>
+              <w:right w:val="single" w:sz="4" w:color="D9D9D9"/>
+            </w:tcBorders>
+            <w:shd w:fill="F6F3F8"/>
+          </w:tcPr>
+          <w:p>
+            <w:pPr>
+              <w:spacing w:after="0" w:line="259" w:lineRule="auto"/>
+            </w:pPr>
+            <w:r>
+              <w:rPr>
+                <w:rFonts w:ascii="Georgia" w:hAnsi="Georgia"/>
+                <w:b w:val="0"/>
+                <w:sz w:val="19"/>
+              </w:rPr>
+              <w:t>5 minute Codex browser run</w:t>
+            </w:r>
+          </w:p>
+        </w:tc>
+        <w:tc>
+          <w:tcPr>
+            <w:tcW w:type="dxa" w:w="7704"/>
+            <w:vAlign w:val="center"/>
+            <w:tcMar>
+              <w:top w:w="105" w:type="dxa"/>
+              <w:left w:w="105" w:type="dxa"/>
+              <w:bottom w:w="105" w:type="dxa"/>
+              <w:right w:w="105" w:type="dxa"/>
+            </w:tcMar>
+            <w:tcBorders>
+              <w:top w:val="single" w:sz="4" w:color="D9D9D9"/>
+              <w:left w:val="single" w:sz="4" w:color="D9D9D9"/>
+              <w:bottom w:val="single" w:sz="4" w:color="D9D9D9"/>
+              <w:right w:val="single" w:sz="4" w:color="D9D9D9"/>
+            </w:tcBorders>
+            <w:shd w:fill="F6F3F8"/>
+          </w:tcPr>
+          <w:p>
+            <w:pPr>
+              <w:spacing w:after="0" w:line="259" w:lineRule="auto"/>
+            </w:pPr>
+            <w:r>
+              <w:rPr>
+                <w:rFonts w:ascii="Georgia" w:hAnsi="Georgia"/>
+                <w:b w:val="0"/>
+                <w:sz w:val="19"/>
+              </w:rPr>
+              <w:t>728/730 reference words; 4 edits, 0.548% word error rate. Rating 48/100; 5 annotations. Saved audio, transcript and report reopened correctly. Worker 17.52 s; queue 4.73 s; coaching 12.81 s, with 4,065 input and 1,510 output tokens.</w:t>
+            </w:r>
+          </w:p>
+        </w:tc>
+      </w:tr>
+      <w:tr>
+        <w:trPr>
+          <w:cantSplit/>
+        </w:trPr>
+        <w:tc>
+          <w:tcPr>
+            <w:tcW w:type="dxa" w:w="2376"/>
+            <w:vAlign w:val="center"/>
+            <w:tcMar>
+              <w:top w:w="105" w:type="dxa"/>
+              <w:left w:w="105" w:type="dxa"/>
+              <w:bottom w:w="105" w:type="dxa"/>
+              <w:right w:w="105" w:type="dxa"/>
+            </w:tcMar>
+            <w:tcBorders>
+              <w:top w:val="single" w:sz="4" w:color="D9D9D9"/>
+              <w:left w:val="single" w:sz="4" w:color="D9D9D9"/>
+              <w:bottom w:val="single" w:sz="4" w:color="D9D9D9"/>
+              <w:right w:val="single" w:sz="4" w:color="D9D9D9"/>
+            </w:tcBorders>
+            <w:shd w:fill="FFFFFF"/>
+          </w:tcPr>
+          <w:p>
+            <w:pPr>
+              <w:spacing w:after="0" w:line="259" w:lineRule="auto"/>
+            </w:pPr>
+            <w:r>
+              <w:rPr>
+                <w:rFonts w:ascii="Georgia" w:hAnsi="Georgia"/>
+                <w:b w:val="0"/>
+                <w:sz w:val="19"/>
+              </w:rPr>
+              <w:t>10 minute Codex browser run</w:t>
+            </w:r>
+          </w:p>
+        </w:tc>
+        <w:tc>
+          <w:tcPr>
+            <w:tcW w:type="dxa" w:w="7704"/>
+            <w:vAlign w:val="center"/>
+            <w:tcMar>
+              <w:top w:w="105" w:type="dxa"/>
+              <w:left w:w="105" w:type="dxa"/>
+              <w:bottom w:w="105" w:type="dxa"/>
+              <w:right w:w="105" w:type="dxa"/>
+            </w:tcMar>
+            <w:tcBorders>
+              <w:top w:val="single" w:sz="4" w:color="D9D9D9"/>
+              <w:left w:val="single" w:sz="4" w:color="D9D9D9"/>
+              <w:bottom w:val="single" w:sz="4" w:color="D9D9D9"/>
+              <w:right w:val="single" w:sz="4" w:color="D9D9D9"/>
+            </w:tcBorders>
+            <w:shd w:fill="FFFFFF"/>
+          </w:tcPr>
+          <w:p>
+            <w:pPr>
+              <w:spacing w:after="0" w:line="259" w:lineRule="auto"/>
+            </w:pPr>
+            <w:r>
+              <w:rPr>
+                <w:rFonts w:ascii="Georgia" w:hAnsi="Georgia"/>
+                <w:b w:val="0"/>
+                <w:sz w:val="19"/>
+              </w:rPr>
+              <w:t>1,456/1,460 reference words; 8 edits, 0.548% word error rate; ending intact. Rating 44/100; 3 annotations. Transcript ready within 41.46 s. Worker 18.75 s; queue 8.04 s; coaching 12.26 s.</w:t>
+            </w:r>
+          </w:p>
+        </w:tc>
+      </w:tr>
+      <w:tr>
+        <w:trPr>
+          <w:cantSplit/>
+        </w:trPr>
+        <w:tc>
+          <w:tcPr>
+            <w:tcW w:type="dxa" w:w="2376"/>
+            <w:vAlign w:val="center"/>
+            <w:tcMar>
+              <w:top w:w="105" w:type="dxa"/>
+              <w:left w:w="105" w:type="dxa"/>
+              <w:bottom w:w="105" w:type="dxa"/>
+              <w:right w:w="105" w:type="dxa"/>
+            </w:tcMar>
+            <w:tcBorders>
+              <w:top w:val="single" w:sz="4" w:color="D9D9D9"/>
+              <w:left w:val="single" w:sz="4" w:color="D9D9D9"/>
+              <w:bottom w:val="single" w:sz="4" w:color="D9D9D9"/>
+              <w:right w:val="single" w:sz="4" w:color="D9D9D9"/>
+            </w:tcBorders>
+            <w:shd w:fill="F6F3F8"/>
+          </w:tcPr>
+          <w:p>
+            <w:pPr>
+              <w:spacing w:after="0" w:line="259" w:lineRule="auto"/>
+            </w:pPr>
+            <w:r>
+              <w:rPr>
+                <w:rFonts w:ascii="Georgia" w:hAnsi="Georgia"/>
+                <w:b w:val="0"/>
+                <w:sz w:val="19"/>
+              </w:rPr>
+              <w:t>5 minute Brave run</w:t>
+            </w:r>
+          </w:p>
+        </w:tc>
+        <w:tc>
+          <w:tcPr>
+            <w:tcW w:type="dxa" w:w="7704"/>
+            <w:vAlign w:val="center"/>
+            <w:tcMar>
+              <w:top w:w="105" w:type="dxa"/>
+              <w:left w:w="105" w:type="dxa"/>
+              <w:bottom w:w="105" w:type="dxa"/>
+              <w:right w:w="105" w:type="dxa"/>
+            </w:tcMar>
+            <w:tcBorders>
+              <w:top w:val="single" w:sz="4" w:color="D9D9D9"/>
+              <w:left w:val="single" w:sz="4" w:color="D9D9D9"/>
+              <w:bottom w:val="single" w:sz="4" w:color="D9D9D9"/>
+              <w:right w:val="single" w:sz="4" w:color="D9D9D9"/>
+            </w:tcBorders>
+            <w:shd w:fill="F6F3F8"/>
+          </w:tcPr>
+          <w:p>
+            <w:pPr>
+              <w:spacing w:after="0" w:line="259" w:lineRule="auto"/>
+            </w:pPr>
+            <w:r>
+              <w:rPr>
+                <w:rFonts w:ascii="Georgia" w:hAnsi="Georgia"/>
+                <w:b w:val="0"/>
+                <w:sz w:val="19"/>
+              </w:rPr>
+              <w:t>Transcription within 16.02 s; coaching 10.99 s. Saving, replay, seek and pause passed. Coaching returned 4 annotations but no audience score or overall rating; recorded as partial.</w:t>
+            </w:r>
+          </w:p>
+        </w:tc>
+      </w:tr>
+      <w:tr>
+        <w:trPr>
+          <w:cantSplit/>
+        </w:trPr>
+        <w:tc>
+          <w:tcPr>
+            <w:tcW w:type="dxa" w:w="2376"/>
+            <w:vAlign w:val="center"/>
+            <w:tcMar>
+              <w:top w:w="105" w:type="dxa"/>
+              <w:left w:w="105" w:type="dxa"/>
+              <w:bottom w:w="105" w:type="dxa"/>
+              <w:right w:w="105" w:type="dxa"/>
+            </w:tcMar>
+            <w:tcBorders>
+              <w:top w:val="single" w:sz="4" w:color="D9D9D9"/>
+              <w:left w:val="single" w:sz="4" w:color="D9D9D9"/>
+              <w:bottom w:val="single" w:sz="4" w:color="D9D9D9"/>
+              <w:right w:val="single" w:sz="4" w:color="D9D9D9"/>
+            </w:tcBorders>
+            <w:shd w:fill="FFFFFF"/>
+          </w:tcPr>
+          <w:p>
+            <w:pPr>
+              <w:spacing w:after="0" w:line="259" w:lineRule="auto"/>
+            </w:pPr>
+            <w:r>
+              <w:rPr>
+                <w:rFonts w:ascii="Georgia" w:hAnsi="Georgia"/>
+                <w:b w:val="0"/>
+                <w:sz w:val="19"/>
+              </w:rPr>
+              <w:t>15 minute upload</w:t>
+            </w:r>
+          </w:p>
+        </w:tc>
+        <w:tc>
+          <w:tcPr>
+            <w:tcW w:type="dxa" w:w="7704"/>
+            <w:vAlign w:val="center"/>
+            <w:tcMar>
+              <w:top w:w="105" w:type="dxa"/>
+              <w:left w:w="105" w:type="dxa"/>
+              <w:bottom w:w="105" w:type="dxa"/>
+              <w:right w:w="105" w:type="dxa"/>
+            </w:tcMar>
+            <w:tcBorders>
+              <w:top w:val="single" w:sz="4" w:color="D9D9D9"/>
+              <w:left w:val="single" w:sz="4" w:color="D9D9D9"/>
+              <w:bottom w:val="single" w:sz="4" w:color="D9D9D9"/>
+              <w:right w:val="single" w:sz="4" w:color="D9D9D9"/>
+            </w:tcBorders>
+            <w:shd w:fill="FFFFFF"/>
+          </w:tcPr>
+          <w:p>
+            <w:pPr>
+              <w:spacing w:after="0" w:line="259" w:lineRule="auto"/>
+            </w:pPr>
+            <w:r>
+              <w:rPr>
+                <w:rFonts w:ascii="Georgia" w:hAnsi="Georgia"/>
+                <w:b w:val="0"/>
+                <w:sz w:val="19"/>
+              </w:rPr>
+              <w:t>Rejected before cloud processing because the limit is ten minutes. The preceding ten minute audio and report were preserved. No browser errors or warnings.</w:t>
+            </w:r>
+          </w:p>
+        </w:tc>
+      </w:tr>
+      <w:tr>
+        <w:trPr>
+          <w:cantSplit/>
+        </w:trPr>
+        <w:tc>
+          <w:tcPr>
+            <w:tcW w:type="dxa" w:w="2376"/>
+            <w:vAlign w:val="center"/>
+            <w:tcMar>
+              <w:top w:w="105" w:type="dxa"/>
+              <w:left w:w="105" w:type="dxa"/>
+              <w:bottom w:w="105" w:type="dxa"/>
+              <w:right w:w="105" w:type="dxa"/>
+            </w:tcMar>
+            <w:tcBorders>
+              <w:top w:val="single" w:sz="4" w:color="D9D9D9"/>
+              <w:left w:val="single" w:sz="4" w:color="D9D9D9"/>
+              <w:bottom w:val="single" w:sz="4" w:color="D9D9D9"/>
+              <w:right w:val="single" w:sz="4" w:color="D9D9D9"/>
+            </w:tcBorders>
+            <w:shd w:fill="F6F3F8"/>
+          </w:tcPr>
+          <w:p>
+            <w:pPr>
+              <w:spacing w:after="0" w:line="259" w:lineRule="auto"/>
+            </w:pPr>
+            <w:r>
+              <w:rPr>
+                <w:rFonts w:ascii="Georgia" w:hAnsi="Georgia"/>
+                <w:b w:val="0"/>
+                <w:sz w:val="19"/>
+              </w:rPr>
+              <w:t>15 minute stress run</w:t>
+            </w:r>
+          </w:p>
+        </w:tc>
+        <w:tc>
+          <w:tcPr>
+            <w:tcW w:type="dxa" w:w="7704"/>
+            <w:vAlign w:val="center"/>
+            <w:tcMar>
+              <w:top w:w="105" w:type="dxa"/>
+              <w:left w:w="105" w:type="dxa"/>
+              <w:bottom w:w="105" w:type="dxa"/>
+              <w:right w:w="105" w:type="dxa"/>
+            </w:tcMar>
+            <w:tcBorders>
+              <w:top w:val="single" w:sz="4" w:color="D9D9D9"/>
+              <w:left w:val="single" w:sz="4" w:color="D9D9D9"/>
+              <w:bottom w:val="single" w:sz="4" w:color="D9D9D9"/>
+              <w:right w:val="single" w:sz="4" w:color="D9D9D9"/>
+            </w:tcBorders>
+            <w:shd w:fill="F6F3F8"/>
+          </w:tcPr>
+          <w:p>
+            <w:pPr>
+              <w:spacing w:after="0" w:line="259" w:lineRule="auto"/>
+            </w:pPr>
+            <w:r>
+              <w:rPr>
+                <w:rFonts w:ascii="Georgia" w:hAnsi="Georgia"/>
+                <w:b w:val="0"/>
+                <w:sz w:val="19"/>
+              </w:rPr>
+              <w:t>900.01 s of wall time: 233 account-switch, retry and replay cycles; 60 ordered ten-second chunks, one in flight; pause excluded; automatic stop at 600 s; one upload and one mocked coaching request; no unhandled rejections. VM controller with mocked DOM, microphone and upstream.</w:t>
+            </w:r>
+          </w:p>
+        </w:tc>
+      </w:tr>
+    </w:tbl>
+    <w:p>
+      <w:pPr>
+        <w:spacing w:after="0"/>
+      </w:pPr>
+      <w:r/>
+    </w:p>
+    <w:p>
+      <w:r>
+        <w:rPr>
+          <w:b/>
+        </w:rPr>
+        <w:t>Progress feedback.</w:t>
+      </w:r>
+      <w:r>
+        <w:t xml:space="preserve"> A compact timeline shows server-confirmed stages without percentages or polling. Stream reads remain bounded and authenticated. Desktop and mobile previews used simulated events. The new progress path has not been tested end to end with a paid provider because the quota was consumed. “Stop waiting” does not promise to cancel admitted cloud work.</w:t>
+      </w:r>
+    </w:p>
+    <w:p>
+      <w:r>
+        <w:rPr>
+          <w:b/>
+        </w:rPr>
+        <w:t>Estimated compute cost.</w:t>
+      </w:r>
+      <w:r>
+        <w:t xml:space="preserve"> The cold five minute run was estimated at 2.51 cents. The five and ten minute runs together were estimated at 5.37 cents, about 0.36 cent per audio minute, including startup and idle time. Supabase and network costs are excluded; these are estimates, not invoices.</w:t>
+      </w:r>
+    </w:p>
+    <w:p>
+      <w:r>
+        <w:t>Release 71ce482 is published on GitHub Pages and saved locally. The updated Supabase gateway is deployed.</w:t>
+      </w:r>
+    </w:p>
+    <w:p>
+      <w:r>
+        <w:t>Controlled reference audio and mocked stress tests do not establish general speech accuracy or security certification. Application reservations are admission controls, not a provider billing ceiling.</w:t>
       </w:r>
     </w:p>
     <w:sectPr>

</xml_diff>